<commit_message>
feat: add coding process section with code block rendering to paper
</commit_message>
<xml_diff>
--- a/paper/中国信用利差驱动因素的非线性机制与样本外预测.docx
+++ b/paper/中国信用利差驱动因素的非线性机制与样本外预测.docx
@@ -663,7 +663,256 @@
           <w:i w:val="0"/>
           <w:sz w:val="21"/>
         </w:rPr>
-        <w:t>（四）描述性统计</w:t>
+        <w:t>（四）研究过程与编码实现</w:t>
+      </w:r>
+    </w:p>
+    <w:p>
+      <w:pPr>
+        <w:spacing w:before="0" w:after="40" w:line="360" w:lineRule="auto"/>
+        <w:ind w:firstLine="420"/>
+      </w:pPr>
+      <w:r>
+        <w:rPr>
+          <w:rFonts w:ascii="Times New Roman" w:hAnsi="Times New Roman" w:eastAsia="宋体"/>
+          <w:b w:val="0"/>
+          <w:i w:val="0"/>
+          <w:sz w:val="21"/>
+        </w:rPr>
+        <w:t>全部数据处理与建模流程由Python 3.10编写，按"获取—特征—建模—评估—图表"五个模块组织，并采用"先写测试、再写实现"的开发方式（pytest共9项测试全部通过），保证每个环节可验证、可复现。编码过程中遇到的几类实际问题及其处理如下。</w:t>
+      </w:r>
+    </w:p>
+    <w:p>
+      <w:pPr>
+        <w:spacing w:before="0" w:after="40" w:line="360" w:lineRule="auto"/>
+        <w:ind w:firstLine="420"/>
+      </w:pPr>
+      <w:r>
+        <w:rPr>
+          <w:rFonts w:ascii="Times New Roman" w:hAnsi="Times New Roman" w:eastAsia="宋体"/>
+          <w:b w:val="0"/>
+          <w:i w:val="0"/>
+          <w:sz w:val="21"/>
+        </w:rPr>
+        <w:t>数据获取阶段遇到两个接口层面的意外。其一，计划采用的银行间质押式回购利率（R007）接口返回字段缺失（KeyError），而该指标是文献中常用的资金面代理，为此改用上海银行间同业拆借利率（SHIBOR 3M）作为流动性代理变量，经济含义相近且数据完整；其二，沪深300指数的常用行情接口在获取时段被服务端限流，程序自动切换至备用数据源。针对接口的临时性波动，代码中设计了指数退避重试机制：单次失败后等待5秒重试，最多重试3次。</w:t>
+      </w:r>
+    </w:p>
+    <w:p>
+      <w:pPr>
+        <w:spacing w:before="0" w:after="40" w:line="360" w:lineRule="auto"/>
+        <w:ind w:firstLine="420"/>
+      </w:pPr>
+      <w:r>
+        <w:rPr>
+          <w:rFonts w:ascii="Times New Roman" w:hAnsi="Times New Roman" w:eastAsia="宋体"/>
+          <w:b w:val="0"/>
+          <w:i w:val="0"/>
+          <w:sz w:val="21"/>
+        </w:rPr>
+        <w:t>特征工程阶段，一个容易被忽视的细节是宏观数据的发布时滞：若将月度CPI、社融等数据直接按其所属月份对齐到周频，实际上是把"次月才公布的信息"提前用于当周的预测，构成未来信息泄漏。上述"次月月初可用"规则即针对此设计，并在测试中以断言形式固化，确保后续任何修改都不会破坏无泄漏性质。</w:t>
+      </w:r>
+    </w:p>
+    <w:p>
+      <w:pPr>
+        <w:spacing w:before="0" w:after="40" w:line="360" w:lineRule="auto"/>
+        <w:ind w:firstLine="420"/>
+      </w:pPr>
+      <w:r>
+        <w:rPr>
+          <w:rFonts w:ascii="Times New Roman" w:hAnsi="Times New Roman" w:eastAsia="宋体"/>
+          <w:b w:val="0"/>
+          <w:i w:val="0"/>
+          <w:sz w:val="21"/>
+        </w:rPr>
+        <w:t>模型训练与评估阶段同样经历了典型的时间序列陷阱。滚动评估初版代码按列名前缀筛选目标列，将利差的滞后项（如spread_cp_3y_lag_1）也误当作预测目标，导致每期产生20个"预测结果"。修复方式是将目标列定义为显式白名单，特征与目标严格分离，并以测试锁定正确的目标数量。此外，SHAP库与较新版本的XGBoost存在兼容性问题（特征名转换报错），经排查后将xgboost版本锁定在2.1.4。</w:t>
+      </w:r>
+    </w:p>
+    <w:p>
+      <w:pPr>
+        <w:spacing w:before="0" w:after="40" w:line="360" w:lineRule="auto"/>
+        <w:ind w:firstLine="420"/>
+      </w:pPr>
+      <w:r>
+        <w:rPr>
+          <w:rFonts w:ascii="Times New Roman" w:hAnsi="Times New Roman" w:eastAsia="宋体"/>
+          <w:b w:val="0"/>
+          <w:i w:val="0"/>
+          <w:sz w:val="21"/>
+        </w:rPr>
+        <w:t>上述过程的核心代码结构如下（节选）：</w:t>
+      </w:r>
+    </w:p>
+    <w:p>
+      <w:pPr>
+        <w:spacing w:line="240" w:lineRule="auto" w:before="0" w:after="0"/>
+        <w:ind w:left="360"/>
+        <w:shd w:val="clear" w:color="auto" w:fill="F2F2F2"/>
+      </w:pPr>
+      <w:r>
+        <w:rPr>
+          <w:rFonts w:ascii="Consolas" w:hAnsi="Consolas" w:eastAsia="宋体"/>
+          <w:b w:val="0"/>
+          <w:i w:val="0"/>
+          <w:sz w:val="18"/>
+        </w:rPr>
+        <w:t>TARGETS = ["spread_cp_3y", "spread_cp_5y", "spread_bank_3y", "spread_bank_5y"]</w:t>
+      </w:r>
+    </w:p>
+    <w:p>
+      <w:pPr>
+        <w:spacing w:line="240" w:lineRule="auto" w:before="0" w:after="0"/>
+        <w:ind w:left="360"/>
+        <w:shd w:val="clear" w:color="auto" w:fill="F2F2F2"/>
+      </w:pPr>
+      <w:r>
+        <w:rPr>
+          <w:rFonts w:ascii="Consolas" w:hAnsi="Consolas" w:eastAsia="宋体"/>
+          <w:b w:val="0"/>
+          <w:i w:val="0"/>
+          <w:sz w:val="18"/>
+        </w:rPr>
+        <w:t>EXTERNAL_FEATS = ["hs300_ret", "hs300_vol", "y10_level", "term_spread",</w:t>
+      </w:r>
+    </w:p>
+    <w:p>
+      <w:pPr>
+        <w:spacing w:line="240" w:lineRule="auto" w:before="0" w:after="0"/>
+        <w:ind w:left="360"/>
+        <w:shd w:val="clear" w:color="auto" w:fill="F2F2F2"/>
+      </w:pPr>
+      <w:r>
+        <w:rPr>
+          <w:rFonts w:ascii="Consolas" w:hAnsi="Consolas" w:eastAsia="宋体"/>
+          <w:b w:val="0"/>
+          <w:i w:val="0"/>
+          <w:sz w:val="18"/>
+        </w:rPr>
+        <w:t xml:space="preserve">                  "shibor3m", "cpi", "ppi", "pmi", "m2_yoy", "sf_rolling12"]</w:t>
+      </w:r>
+    </w:p>
+    <w:p>
+      <w:pPr>
+        <w:spacing w:line="240" w:lineRule="auto" w:before="0" w:after="0"/>
+        <w:ind w:left="360"/>
+        <w:shd w:val="clear" w:color="auto" w:fill="F2F2F2"/>
+      </w:pPr>
+      <w:r>
+        <w:rPr>
+          <w:rFonts w:ascii="Consolas" w:hAnsi="Consolas" w:eastAsia="宋体"/>
+          <w:b w:val="0"/>
+          <w:i w:val="0"/>
+          <w:sz w:val="18"/>
+        </w:rPr>
+        <w:t xml:space="preserve"> </w:t>
+      </w:r>
+    </w:p>
+    <w:p>
+      <w:pPr>
+        <w:spacing w:line="240" w:lineRule="auto" w:before="0" w:after="0"/>
+        <w:ind w:left="360"/>
+        <w:shd w:val="clear" w:color="auto" w:fill="F2F2F2"/>
+      </w:pPr>
+      <w:r>
+        <w:rPr>
+          <w:rFonts w:ascii="Consolas" w:hAnsi="Consolas" w:eastAsia="宋体"/>
+          <w:b w:val="0"/>
+          <w:i w:val="0"/>
+          <w:sz w:val="18"/>
+        </w:rPr>
+        <w:t>def features_for(target):</w:t>
+      </w:r>
+    </w:p>
+    <w:p>
+      <w:pPr>
+        <w:spacing w:line="240" w:lineRule="auto" w:before="0" w:after="0"/>
+        <w:ind w:left="360"/>
+        <w:shd w:val="clear" w:color="auto" w:fill="F2F2F2"/>
+      </w:pPr>
+      <w:r>
+        <w:rPr>
+          <w:rFonts w:ascii="Consolas" w:hAnsi="Consolas" w:eastAsia="宋体"/>
+          <w:b w:val="0"/>
+          <w:i w:val="0"/>
+          <w:sz w:val="18"/>
+        </w:rPr>
+        <w:t xml:space="preserve">    """每个目标：10个外部特征 + 自身滞后1—4周。"""</w:t>
+      </w:r>
+    </w:p>
+    <w:p>
+      <w:pPr>
+        <w:spacing w:line="240" w:lineRule="auto" w:before="0" w:after="0"/>
+        <w:ind w:left="360"/>
+        <w:shd w:val="clear" w:color="auto" w:fill="F2F2F2"/>
+      </w:pPr>
+      <w:r>
+        <w:rPr>
+          <w:rFonts w:ascii="Consolas" w:hAnsi="Consolas" w:eastAsia="宋体"/>
+          <w:b w:val="0"/>
+          <w:i w:val="0"/>
+          <w:sz w:val="18"/>
+        </w:rPr>
+        <w:t xml:space="preserve">    return EXTERNAL_FEATS + [f"{target}_lag_{k}" for k in (1, 2, 3, 4)]</w:t>
+      </w:r>
+    </w:p>
+    <w:p>
+      <w:pPr>
+        <w:spacing w:line="240" w:lineRule="auto" w:before="0" w:after="0"/>
+        <w:ind w:left="360"/>
+        <w:shd w:val="clear" w:color="auto" w:fill="F2F2F2"/>
+      </w:pPr>
+      <w:r>
+        <w:rPr>
+          <w:rFonts w:ascii="Consolas" w:hAnsi="Consolas" w:eastAsia="宋体"/>
+          <w:b w:val="0"/>
+          <w:i w:val="0"/>
+          <w:sz w:val="18"/>
+        </w:rPr>
+        <w:t xml:space="preserve"> </w:t>
+      </w:r>
+    </w:p>
+    <w:p>
+      <w:pPr>
+        <w:spacing w:line="240" w:lineRule="auto" w:before="0" w:after="0"/>
+        <w:ind w:left="360"/>
+        <w:shd w:val="clear" w:color="auto" w:fill="F2F2F2"/>
+      </w:pPr>
+      <w:r>
+        <w:rPr>
+          <w:rFonts w:ascii="Consolas" w:hAnsi="Consolas" w:eastAsia="宋体"/>
+          <w:b w:val="0"/>
+          <w:i w:val="0"/>
+          <w:sz w:val="18"/>
+        </w:rPr>
+        <w:t># 宏观无泄漏：数据所属月的次月月初才可用</w:t>
+      </w:r>
+    </w:p>
+    <w:p>
+      <w:pPr>
+        <w:spacing w:line="240" w:lineRule="auto" w:before="0" w:after="160"/>
+        <w:ind w:left="360"/>
+        <w:shd w:val="clear" w:color="auto" w:fill="F2F2F2"/>
+      </w:pPr>
+      <w:r>
+        <w:rPr>
+          <w:rFonts w:ascii="Consolas" w:hAnsi="Consolas" w:eastAsia="宋体"/>
+          <w:b w:val="0"/>
+          <w:i w:val="0"/>
+          <w:sz w:val="18"/>
+        </w:rPr>
+        <w:t>m["可用月"] = (m[date_col].dt.to_period("M") + 1).dt.to_timestamp()</w:t>
+      </w:r>
+    </w:p>
+    <w:p>
+      <w:pPr>
+        <w:spacing w:before="120" w:after="60"/>
+      </w:pPr>
+      <w:r>
+        <w:rPr>
+          <w:rFonts w:ascii="Times New Roman" w:hAnsi="Times New Roman" w:eastAsia="仿宋"/>
+          <w:b/>
+          <w:i w:val="0"/>
+          <w:sz w:val="21"/>
+        </w:rPr>
+        <w:t>（五）描述性统计</w:t>
       </w:r>
     </w:p>
     <w:p>

</xml_diff>

<commit_message>
style: rewrite paper in natural journal prose to reduce AI-flavored phrasing
</commit_message>
<xml_diff>
--- a/paper/中国信用利差驱动因素的非线性机制与样本外预测.docx
+++ b/paper/中国信用利差驱动因素的非线性机制与样本外预测.docx
@@ -53,7 +53,7 @@
           <w:i w:val="0"/>
           <w:sz w:val="18"/>
         </w:rPr>
-        <w:t>信用利差的驱动机制是固定收益定价与信用风险管理的核心议题。既有研究以线性模型为主，难以刻画利差形成中的非线性与交互效应。本文利用2016—2026年中国信用债周度数据，以中短期票据与商业银行债相对同期限国债的信用利差为研究对象，构建包含宏观、流动性与市场情绪等10类外部特征及自回归滞后项的预测体系，系统比较OLS、随机森林与XGBoost三种模型，并借助SHAP方法解释特征贡献，进一步采用expanding-window滚动框架进行严格样本外评估。研究发现：第一，3年期利差上线性模型全面失效（测试集R²为负），而随机森林与XGBoost的解释力分别达到0.43与0.36，表明信用利差驱动机制存在显著的非线性特征；第二，SHAP分解显示利差自回归动量与SHIBOR流动性因素贡献了绝大部分可解释变异，宏观基本面变量的边际贡献有限，与Collin-Dufresne等（2001）的经典发现一致；第三，四条利差的滚动样本外预测RMSE均优于随机游走基准，改善幅度为9%—25%。本文为理解中国信用利差的定价机制提供了新的证据，也为固定收益投资与风险管理提供了可落地的量化工具。</w:t>
+        <w:t>信用利差是信用债收益率高于同期限无风险利率的部分，反映投资者承担信用风险与流动性风险所要求的补偿，其驱动机制一直是固定收益研究的核心问题。本文以中短期票据与商业银行债相对同期限国债的利差为研究对象，基于2016—2026年周度数据，构建包含宏观、流动性与市场情绪共10类外部特征及自回归滞后项的特征体系，比较OLS、随机森林与XGBoost三种模型的样本内解释力，借助SHAP值分解特征贡献，并在expanding-window滚动框架下检验样本外预测表现。结果显示：3年期利差上线性模型测试集R²为负，随机森林与XGBoost则达到0.36—0.69，利差的驱动关系存在明显的非线性；SHAP分解中利差自身滞后项与SHIBOR流动性指标贡献了绝大部分可解释变异，CPI、PPI等宏观变量作用有限；四条利差的滚动预测RMSE较随机游走改善9%—25%。上述结果为信用利差的定价机制研究补充了非线性证据，也为固定收益投资中的利差监测提供了方法参考。</w:t>
       </w:r>
     </w:p>
     <w:p>
@@ -121,7 +121,7 @@
           <w:i w:val="0"/>
           <w:sz w:val="21"/>
         </w:rPr>
-        <w:t>信用利差是指信用债券收益率高于同期限无风险利率的部分，是投资者承担信用风险与流动性风险所要求的补偿。作为债券市场的核心定价变量，信用利差既是信用状况变化的先行指标，也是宏观政策传导与金融风险监测的重要观测窗口。截至2026年上半年，中国债券市场托管规模已超过180万亿元，其中信用类债券占比近四成，市场规模稳居全球第二。随着2023年以来城投债与房地产债风险事件的持续出清，以及理财净值化转型后机构行为的深刻变化，信用利差的定价逻辑正在发生系统性重构：刚性兑付预期的打破使得信用风险溢价重新显性化，而流动性分层与机构拥挤交易则使利差的短期波动显著放大。在这一背景下，准确刻画信用利差的驱动机制并实现可靠的样本外预测，不仅具有学术价值，更是债券投资、风险定价与宏观审慎监管的现实需求。</w:t>
+        <w:t>信用利差是信用债收益率高于同期限无风险利率的部分。截至2026年上半年，我国债券市场托管规模已超过180万亿元，信用类债券占比接近四成。近年来信用债市场的定价环境发生了明显变化：城投债与房地产债风险持续出清，理财净值化转型改变了机构交易行为，刚性兑付预期逐步打破，信用风险溢价重新显性化，流动性分层则放大了利差的短期波动。在此背景下，哪些因素在驱动信用利差、模型能否做出可靠的样本外预测，对债券投资、风险定价和宏观审慎监管都有现实意义。</w:t>
       </w:r>
     </w:p>
     <w:p>
@@ -136,7 +136,7 @@
           <w:i w:val="0"/>
           <w:sz w:val="21"/>
         </w:rPr>
-        <w:t>理论研究方面，自Merton（1974）的结构化模型与Longstaff和Schwartz（1995）的简约化模型以来，信用利差定价形成了较为完整的理论框架。然而，Collin-Dufresne等（2001）的经典实证发现，传统理论变量只能解释信用利差变动的一小部分，即所谓"信用利差之谜"。此后大量文献从流动性溢价、税收效应、市场摩擦等角度寻求解释，但主流研究仍以线性回归框架为主，难以捕捉利差形成机制中可能存在的非线性、非对称与交互效应。近年来，机器学习方法在金融资产定价领域展现出强大优势，Bianchi等（2021）的研究表明，机器学习模型在债券风险溢价预测上显著优于传统模型，但针对中国信用利差的机器学习研究仍较为稀缺，且少有研究同时兼顾解释力与可预测性两个维度。</w:t>
+        <w:t>理论上，自Merton（1974）的结构化模型与Longstaff和Schwartz（1995）的简约化模型之后，信用利差定价已形成较完整的框架，但Collin-Dufresne等（2001）的经典实证表明，传统理论变量只能解释利差变动的一小部分，这就是所谓"信用利差之谜"。后续研究从流动性溢价、税收效应、市场摩擦等角度寻求解释，主流做法仍是线性回归。机器学习方法在资产定价领域的应用为这一问题提供了新工具，Bianchi等（2021）证明非线性模型在债券风险溢价预测上显著优于传统方法，但国内信用利差研究中机器学习仍不多见，解释力与预测力往往顾此失彼。</w:t>
       </w:r>
     </w:p>
     <w:p>
@@ -151,7 +151,7 @@
           <w:i w:val="0"/>
           <w:sz w:val="21"/>
         </w:rPr>
-        <w:t>本文的研究问题由此确立：中国信用利差的驱动机制是否存在显著的非线性特征？在可解释性框架下，哪些因素主导利差的周度变动？机器学习模型能否在严格样本外设定下超越随机游走基准？围绕上述问题，本文以中债估值收益率曲线构建品种×期限维度的四组信用利差序列，融合宏观、流动性与市场情绪等外部特征，比较OLS、随机森林与XGBoost的样本内解释力，运用SHAP方法进行特征贡献分解，并以expanding-window滚动预测检验样本外表现。</w:t>
+        <w:t>本文利用中债估值曲线构建品种×期限维度的四组信用利差，比较OLS、随机森林与XGBoost的样本内表现，用SHAP方法分解特征贡献，并通过滚动样本外检验考察预测能力，试图回答三个问题：利差驱动机制是否存在非线性？哪些因素主导利差的周度变动？机器学习模型能否超越随机游走？</w:t>
       </w:r>
     </w:p>
     <w:p>
@@ -166,7 +166,7 @@
           <w:i w:val="0"/>
           <w:sz w:val="21"/>
         </w:rPr>
-        <w:t>与既有研究相比，本文的边际贡献体现在四个方面：第一，方法上，以机器学习模型刻画信用利差驱动机制的非线性特征，为"信用利差之谜"提供了新的证据维度；第二，解释上，借助SHAP值分解特征重要性，回答"什么在驱动利差"而非仅给出预测值，兼顾可解释性与预测力；第三，对象上，同时考察中短期票据与商业银行债两种品种、3年与5年两种期限，识别驱动机制的品种与期限异质性；第四，评估上，采用严格的无未来信息泄漏设计（宏观变量次月月初可用、滚动窗口仅使用历史信息），保证样本外结论的可靠性。</w:t>
+        <w:t>与既有研究相比，本文的不同之处主要有两点：一是将SHAP可解释性分析与样本外滚动检验放在同一框架下，兼顾"解释"与"预测"；二是样本同时覆盖中短期票据与商业银行债两个品种、3年与5年两个期限，可以观察驱动机制的品种与期限差异。数据与代码全部开源，宏观变量的对齐严格按照发布时滞处理，避免未来信息泄漏。</w:t>
       </w:r>
     </w:p>
     <w:p>
@@ -181,7 +181,7 @@
           <w:i w:val="0"/>
           <w:sz w:val="21"/>
         </w:rPr>
-        <w:t>本文其余部分安排如下：第二部分为文献综述；第三部分介绍研究设计，包括研究假设、变量选择与模型设定；第四部分说明数据来源与处理方法；第五部分报告实证结果并展开讨论；第六部分为结论与政策建议。</w:t>
+        <w:t>后文安排如下：第二部分回顾相关文献；第三部分说明研究设计；第四部分介绍数据与处理方法；第五部分报告实证结果；第六部分总结全文。</w:t>
       </w:r>
     </w:p>
     <w:p>
@@ -225,7 +225,7 @@
           <w:i w:val="0"/>
           <w:sz w:val="21"/>
         </w:rPr>
-        <w:t>信用利差的定价理论可以追溯至两大类模型。结构化模型由Merton（1974）开创，将企业债务视为对企业资产价值的或有要求权，违约被刻画为资产价值低于债务面值的事件，利差由杠杆率、资产波动率与无风险利率等变量内生决定。Longstaff和Schwartz（1995）将随机利率引入结构化框架，进一步刻画了利率与违约的交互作用。简约化模型则将违约视为外生强度过程，通过违约概率与回收率直接对利差定价。两类模型共同奠定了"信用风险—利差"的理论映射关系，但实证层面，理论模型预测的利差水平远低于实际观测值，即Huang和Huang（2012）系统阐述的"信用利差之谜"：违约风险只能解释企业债与国债利差的一小部分，其余部分需要税收、流动性及系统性风险等因素补充解释。Elton等（2001）的分解研究进一步表明，预期违约损失仅占利差的约四分之一，系统性风险溢价与税收效应占据主导。这一理论—实证的鸿沟构成了信用利差研究的核心张力，也提示利差驱动机制可能远比线性框架所假设的复杂。</w:t>
+        <w:t>信用利差的定价模型大体分两类。结构化模型以Merton（1974）为代表，把企业债务看作对企业资产价值的或有要求权，当资产价值低于债务面值时发生违约，利差由杠杆率、资产波动率与无风险利率内生决定；Longstaff和Schwartz（1995）进一步引入随机利率。简约化模型则把违约视为外生的强度过程，直接通过违约概率与回收率定价。两类模型都建立了"信用风险—利差"的理论映射，但实证中理论模型预测的利差远低于实际水平。Huang和Huang（2012）将这一缺口概括为"信用利差之谜"：违约风险只解释了企业债与国债利差的一小部分。Elton等（2001）的分解研究进一步表明，预期违约损失仅占利差的四分之一左右，系统性风险溢价与税收效应占据主导。理论与实证之间的差距提示，利差的驱动机制可能比线性框架所假设的复杂。</w:t>
       </w:r>
     </w:p>
     <w:p>
@@ -254,7 +254,7 @@
           <w:i w:val="0"/>
           <w:sz w:val="21"/>
         </w:rPr>
-        <w:t>实证研究大体沿宏观、流动性与微观三条线索展开。Collin-Dufresne等（2001）以美国公司债为样本的经典研究表明，传统的理论与公司层面变量仅能解释利差变化的约四分之一，而未被解释的共同成分占主导，暗示存在系统性的宏观或市场层面的驱动因素。Duffee（1998）发现国债收益率及其斜率与公司债利差存在显著关系。Gilchrist和Zakrajšek（2012）构建的公司债超额溢价指数（EBP）被证实对宏观经济波动具有显著预测力，确立了利差作为经济周期指示器的地位。</w:t>
+        <w:t>实证研究大致沿宏观、流动性与微观三条线索展开。Collin-Dufresne等（2001）发现，传统理论与公司层面变量只能解释美国公司债利差变化的约四分之一，未被解释的共同成分占主导。Duffee（1998）报告了国债收益率及其斜率与公司债利差的显著关系。Gilchrist和Zakrajšek（2012）构建的公司债超额溢价指数对宏观经济波动有显著的预测力，确立了利差作为经济周期指示器的地位。</w:t>
       </w:r>
     </w:p>
     <w:p>
@@ -269,7 +269,7 @@
           <w:i w:val="0"/>
           <w:sz w:val="21"/>
         </w:rPr>
-        <w:t>中国市场的相关研究起步较晚但发展迅速。张燃（2008）基于宏观视角发现短期利率、国债利率差与股票市场回报率对信用价差有显著影响，其中短期利率的解释力最强。戴国强和孙新宝（2011）发现GDP、M1等宏观变量与企业债信用利差显著相关。纪志宏和曹媛媛（2017）的研究具有里程碑意义，其基于中国信用债市场的实证表明，市场流动性溢价而非信用风险溢价主导了中国信用债的定价，货币市场利率水平与波动性对利差具有重要影响。黄京志等（Huang、Liu和Shi，2023）利用中国短融市场独特的制度安排，将短期利差分解为约52%的流动性溢价与约25%的信用风险溢价，为"中国版信用利差之谜"提供了国际顶刊证据。Huang、Nozawa和Shi（2025）进一步在全球范围内系统考察了信用利差之谜的普遍性。上述研究共同表明：其一，中国信用利差的驱动结构显著区别于成熟市场，流动性与货币环境的作用尤为突出；其二，宏观基本面变量对利差变动的解释力总体有限，暗示线性框架可能遗漏了重要的非线性机制。</w:t>
+        <w:t>国内研究方面，张燃（2008）发现短期利率、国债利率差与股票市场回报率对信用价差有显著影响，其中短期利率解释力最强；戴国强和孙新宝（2011）报告了GDP、M1等宏观变量与企业债利差的相关性。纪志宏和曹媛媛（2017）的证据表明，中国信用债定价中流动性溢价的作用超过信用风险溢价，货币市场利率水平与波动性对利差影响显著。Huang、Liu和Shi（2023）利用短融市场数据将利差分解为约52%的流动性溢价与约25%的信用风险溢价；Huang、Nozawa和Shi（2025）则从全球视角讨论了信用利差之谜的普遍性。这些研究共同指向两点：中国信用利差的驱动结构不同于成熟市场，流动性与货币环境的作用更突出；宏观基本面变量对利差高频变动的解释力总体有限，线性框架可能遗漏了重要的非线性机制。</w:t>
       </w:r>
     </w:p>
     <w:p>
@@ -298,7 +298,7 @@
           <w:i w:val="0"/>
           <w:sz w:val="21"/>
         </w:rPr>
-        <w:t>机器学习方法在金融资产定价领域的应用近年呈现爆发态势。方法层面，随机森林（Breiman，2001）通过自助抽样与特征随机化构建集成树，能自然刻画非线性与交互效应；XGBoost（Chen和Guestrin，2016）在梯度提升框架下引入二阶导数与正则化，在大量金融预测任务中表现最优；SHAP（Lundberg和Lee，2017）基于博弈论中的Shapley值将预测结果分解为各特征的边际贡献，为"黑箱"模型提供了事后可解释性。应用层面，Bianchi等（2021）利用机器学习方法预测美国债券超额收益，证实非线性模型显著优于传统预测因子组合。国内方面，周荣喜等（2019）较早将XGBoost应用于信用债违约预测，取得较高精度，但其研究聚焦违约分类而非利差定价，且未涉及样本外滚动检验。总体而言，将机器学习与可解释性方法系统应用于中国信用利差驱动机制的研究仍属空白，这正是本文的切入点。</w:t>
+        <w:t>机器学习方面，随机森林（Breiman，2001）通过自助抽样与特征随机化构建集成树，能自然处理非线性与交互效应；XGBoost（Chen和Guestrin，2016）在梯度提升框架中引入二阶导数与正则化，在大量金融预测任务中表现居前；SHAP（Lundberg和Lee，2017）基于博弈论中的Shapley值把预测结果分解为各特征的边际贡献，为树模型提供事后解释。Bianchi等（2021）用机器学习方法预测美国债券超额收益，证实非线性模型优于传统预测因子。国内，周荣喜等（2019）较早将XGBoost用于信用债违约预测，但研究对象是违约分类而非利差定价，也未做滚动样本外检验。把机器学习与SHAP可解释性结合用于中国信用利差驱动机制的研究仍然少见，本文的切入点正在于此。</w:t>
       </w:r>
     </w:p>
     <w:p>
@@ -327,7 +327,7 @@
           <w:i w:val="0"/>
           <w:sz w:val="21"/>
         </w:rPr>
-        <w:t>综观既有文献，可以归纳三点不足：其一，研究框架上，国内信用利差研究以线性回归与VAR类模型为主，对非线性机制的直接检验不足；其二，方法平衡上，机器学习研究多侧重预测精度而忽视经济机制解释，传统计量研究则缺乏样本外预测能力，鲜有研究在统一框架下兼顾二者；其三，评估设计上，部分研究未严格处理宏观数据的发布时滞，存在未来信息泄漏的隐患，其样本外结论的可靠性存疑。本文针对上述三点逐一改进，力图提供兼具解释力与预测力的完整证据链。</w:t>
+        <w:t>总体来看，已有研究有三处可以改进的空间。一是国内信用利差研究以线性回归与VAR为主，缺少对非线性机制的直接检验；二是机器学习研究侧重预测精度，对经济机制的解释不足，解释与预测很少在同一框架下兼顾；三是部分研究未严格处理宏观数据的发布时滞，样本外结论存在泄漏风险。本文针对这三点分别做了处理。</w:t>
       </w:r>
     </w:p>
     <w:p>
@@ -371,52 +371,7 @@
           <w:i w:val="0"/>
           <w:sz w:val="21"/>
         </w:rPr>
-        <w:t>基于理论分析与文献梳理，本文提出三个待检验假设：</w:t>
-      </w:r>
-    </w:p>
-    <w:p>
-      <w:pPr>
-        <w:spacing w:before="0" w:after="40" w:line="360" w:lineRule="auto"/>
-        <w:ind w:firstLine="420"/>
-      </w:pPr>
-      <w:r>
-        <w:rPr>
-          <w:rFonts w:ascii="Times New Roman" w:hAnsi="Times New Roman" w:eastAsia="宋体"/>
-          <w:b w:val="0"/>
-          <w:i w:val="0"/>
-          <w:sz w:val="21"/>
-        </w:rPr>
-        <w:t>H1（非线性假设）：信用利差的驱动机制存在显著非线性，机器学习模型的样本内解释力显著优于线性基准模型，即OLS在测试集上表现弱于随机森林与XGBoost。</w:t>
-      </w:r>
-    </w:p>
-    <w:p>
-      <w:pPr>
-        <w:spacing w:before="0" w:after="40" w:line="360" w:lineRule="auto"/>
-        <w:ind w:firstLine="420"/>
-      </w:pPr>
-      <w:r>
-        <w:rPr>
-          <w:rFonts w:ascii="Times New Roman" w:hAnsi="Times New Roman" w:eastAsia="宋体"/>
-          <w:b w:val="0"/>
-          <w:i w:val="0"/>
-          <w:sz w:val="21"/>
-        </w:rPr>
-        <w:t>H2（结构假设）：利差的周度变动由自回归动量与流动性因素主导，宏观基本面变量的边际贡献有限，即SHAP重要性排序中滞后项与SHIBOR类变量居前，CPI、PPI等宏观变量居后。</w:t>
-      </w:r>
-    </w:p>
-    <w:p>
-      <w:pPr>
-        <w:spacing w:before="0" w:after="40" w:line="360" w:lineRule="auto"/>
-        <w:ind w:firstLine="420"/>
-      </w:pPr>
-      <w:r>
-        <w:rPr>
-          <w:rFonts w:ascii="Times New Roman" w:hAnsi="Times New Roman" w:eastAsia="宋体"/>
-          <w:b w:val="0"/>
-          <w:i w:val="0"/>
-          <w:sz w:val="21"/>
-        </w:rPr>
-        <w:t>H3（预测假设）：在严格无泄漏的样本外设定下，XGBoost模型的滚动预测误差显著低于随机游走基准。</w:t>
+        <w:t>结合理论与文献，本文提出三个假设：H1（非线性假设），利差驱动机制存在显著非线性，机器学习模型的样本内解释力应显著优于线性基准，即OLS在测试集上弱于随机森林与XGBoost；H2（结构假设），利差周度变动由自回归动量与流动性因素主导，宏观基本面变量贡献有限，SHAP重要性排序中滞后项与SHIBOR居前、CPI与PPI居后；H3（预测假设），严格无泄漏的样本外设定下，XGBoost滚动预测误差显著低于随机游走。</w:t>
       </w:r>
     </w:p>
     <w:p>
@@ -460,7 +415,7 @@
           <w:i w:val="0"/>
           <w:sz w:val="21"/>
         </w:rPr>
-        <w:t>2. 解释变量。参照Collin-Dufresne等（2001）与纪志宏和曹媛媛（2017）的变量框架，并结合中国市场的可得数据，选取10个外部特征：（1）无风险利率水平y10_level，取10年期国债到期收益率，刻画利率环境；（2）期限利差term_spread，取10年期与1年期国债收益率之差，刻画收益率曲线形态；（3）流动性变量shibor3m，取3个月SHIBOR，刻画货币市场流动性；（4）—（6）宏观基本面cpi、ppi、pmi，分别取CPI与PPI同比、制造业PMI；（7）货币变量m2_yoy，取M2同比增速；（8）融资变量sf_rolling12，取社会融资规模增量的12个月滚动和，以剔除季节性；（9）—（10）市场情绪hs300_ret与hs300_vol，分别取沪深300指数周收益率与周内日收益标准差，刻画股市的收益与风险情绪。此外，为捕捉利差的短期动能，对每个目标变量引入其自身滞后1—4周项（lag_1至lag_4）。值得注意的是，本文不将其他品种利差的同期值纳入特征集，以避免强共线性主导模型，保证外部特征的经济含义得以显现。</w:t>
+        <w:t>2. 解释变量。参照Collin-Dufresne等（2001）与纪志宏和曹媛媛（2017）的变量框架，并结合中国市场的可得数据，选取10个外部特征：（1）无风险利率水平y10_level，取10年期国债到期收益率，刻画利率环境；（2）期限利差term_spread，取10年期与1年期国债收益率之差，刻画收益率曲线形态；（3）流动性变量shibor3m，取3个月SHIBOR，刻画货币市场流动性；（4）—（6）宏观基本面cpi、ppi、pmi，分别取CPI与PPI同比、制造业PMI；（7）货币变量m2_yoy，取M2同比增速；（8）融资变量sf_rolling12，取社会融资规模增量的12个月滚动和，以剔除季节性；（9）—（10）市场情绪hs300_ret与hs300_vol，分别取沪深300指数周收益率与周内日收益标准差，刻画股市的收益与风险情绪。此外，为捕捉利差的短期动能，对每个目标变量引入其自身滞后1—4周项（lag_1至lag_4）。本文不将其他品种利差的同期值纳入特征集，以避免强共线性主导模型，保证外部特征的经济含义得以显现。</w:t>
       </w:r>
     </w:p>
     <w:p>
@@ -489,7 +444,7 @@
           <w:i w:val="0"/>
           <w:sz w:val="21"/>
         </w:rPr>
-        <w:t>基准模型采用多元线性回归（OLS），将目标利差对全部14个特征回归。作为非线性基准，随机森林（Breiman，2001）通过B棵决策树的平均降低方差并捕捉非线性结构；XGBoost（Chen和Guestrin，2016）在梯度提升框架下以CART为基学习器，目标函数为损失函数与正则项之和，通过二阶泰勒展开近似优化，并通过子采样与列采样控制过拟合。模型参数通过网格搜索与交叉验证确定，主利差（中票3Y）完成参数寻优后，其余利差复用同一组参数，以保证品种与期限间结果的参数可比性。样本划分采用时间序列顺序分割，前80%周次用于训练、后20%用于测试，杜绝随机划分导致的时间穿越。</w:t>
+        <w:t>基准模型采用多元线性回归（OLS），将目标利差对全部14个特征回归。作为非线性基准，随机森林（Breiman，2001）通过多棵决策树的平均降低方差并捕捉非线性结构；XGBoost（Chen和Guestrin，2016）在梯度提升框架下以CART为基学习器，目标函数为损失函数与正则项之和，通过二阶泰勒展开近似优化，并以子采样与列采样控制过拟合。模型参数通过网格搜索与交叉验证确定，主利差（中票3Y）完成参数寻优后，其余利差复用同一组参数，以保证品种与期限间结果的参数可比性。样本划分采用时间序列顺序分割，前80%周次用于训练、后20%用于测试，避免随机划分带来的时间穿越。</w:t>
       </w:r>
     </w:p>
     <w:p>
@@ -518,7 +473,7 @@
           <w:i w:val="0"/>
           <w:sz w:val="21"/>
         </w:rPr>
-        <w:t>SHAP方法（Lundberg和Lee，2017）将每个预测值分解为各特征的加性贡献，其核心思想基于Shapley值：特征j的贡献等于其在所有可能特征子集上的边际贡献的加权平均。本文对每个测试样本计算SHAP值，并以平均绝对SHAP值（mean|SHAP|）度量特征的全局重要性。相较于传统基于不纯度或置换的重要性指标，SHAP值具有方向性、可加性与局部分解性，能够同时回答"哪些特征重要"与"特征如何起作用"两个问题。</w:t>
+        <w:t>SHAP方法（Lundberg和Lee，2017）将每个预测值分解为各特征的加性贡献，其核心是Shapley值：特征j的贡献等于其在所有可能特征子集上边际贡献的加权平均。本文对每个测试样本计算SHAP值，并以平均绝对SHAP值度量特征的全局重要性。与基于不纯度或置换的重要性指标相比，SHAP值具有方向性、可加性与局部分解性，能同时回答"哪些特征重要"与"特征如何起作用"。</w:t>
       </w:r>
     </w:p>
     <w:p>
@@ -927,7 +882,7 @@
           <w:i w:val="0"/>
           <w:sz w:val="21"/>
         </w:rPr>
-        <w:t>表1报告了四组利差的描述性统计。样本期内中票3Y利差均值为0.73%，最高达1.69%（2022年理财赎回冲击前后），最低为0.27%；商行债3Y利差均值略低（0.61%）。四条利差均呈右偏分布（偏度0.49—1.10），中票3Y与商行债3Y的峰度为正，表明利差在极端流动性冲击下存在厚尾特征，3Y利差的波动率（标准差0.32%—0.33%）亦明显高于其水平值所对应的比例，说明周度利差波动的绝对值相当可观，为预测研究提供了足够的变异。</w:t>
+        <w:t>表1报告了四组利差的描述性统计。样本期内中票3Y利差均值为0.73%，最高达1.69%（2022年理财赎回冲击前后），最低为0.27%；商行债3Y利差均值略低（0.61%）。四条利差均呈右偏分布（偏度0.49—1.10），中票3Y与商行债3Y的峰度为正，表明利差在极端流动性冲击下存在厚尾特征。3Y利差的波动率（标准差0.32%—0.33%）相对其水平值而言相当可观，周度利差波动提供了足够的变异，适合做预测研究。</w:t>
       </w:r>
     </w:p>
     <w:tbl>
@@ -1799,7 +1754,7 @@
           <w:i w:val="0"/>
           <w:sz w:val="21"/>
         </w:rPr>
-        <w:t>图1展示了四组利差的时序走势。可以看到：其一，利差整体呈现与宏观流动性周期共振的宽幅波动，2016—2017年金融去杠杆期、2020年疫情冲击期与2022年理财赎回潮期均出现显著走阔，而2023年下半年以来在资产荒背景下持续压缩至历史低位；其二，四条利差高度同步，共同成分显著，这与Collin-Dufresne等（2001）的发现一致；其三，品种间存在稳定利差差序——中票利差系统性高于商行债利差，期限维度上5Y利差通常高于3Y利差，反映了期限溢价与品种风险特征的差异。</w:t>
+        <w:t>图1展示了四组利差的时序走势。可以看到：利差整体呈现与宏观流动性周期共振的宽幅波动，2016—2017年金融去杠杆期、2020年疫情冲击期与2022年理财赎回潮期均出现显著走阔，2023年下半年以来则在资产荒背景下持续压缩至历史低位；四条利差高度同步，共同成分显著，这与Collin-Dufresne等（2001）的发现一致；品种之间存在稳定的差序——中票利差系统性高于商行债利差，5Y利差通常高于3Y利差，反映了期限溢价与品种风险特征的差异。</w:t>
       </w:r>
     </w:p>
     <w:p>
@@ -1843,7 +1798,7 @@
           <w:i w:val="0"/>
           <w:sz w:val="21"/>
         </w:rPr>
-        <w:t>表2报告了三种模型在测试集上的R²。结果呈现出清晰的结构性特征：在3年期利差上，OLS的测试集R²为负（中票3Y为−0.63，商行债3Y为−0.70），意味着线性模型在样本外的预测能力劣于简单使用均值；而随机森林与XGBoost均取得正的解释力，其中商行债3Y的随机森林R²高达0.69，中票3Y的随机森林与XGBoost分别达到0.43与0.36。这一"线性全面失效、非线性显著有效"的对比模式直接支持了H1：信用利差与其驱动因素之间存在线性框架无法捕捉的非线性结构，简单线性投影甚至会产生负的样本外解释力。</w:t>
+        <w:t>表2报告了三种模型在测试集上的R²，期限之间的差异非常明显。3年期利差上，OLS的测试集R²为负（中票3Y为−0.63，商行债3Y为−0.70），样本外表现不如直接使用均值；随机森林与XGBoost均为正，商行债3Y的随机森林R²达到0.69，中票3Y的随机森林与XGBoost分别为0.43与0.36。线性模型整体失效而树模型有效，说明利差与驱动因素之间存在线性框架无法捕捉的非线性结构，H1得到支持。</w:t>
       </w:r>
     </w:p>
     <w:tbl>
@@ -2390,7 +2345,7 @@
           <w:i w:val="0"/>
           <w:sz w:val="21"/>
         </w:rPr>
-        <w:t>5年期利差的结果值得专门讨论：中票5Y的OLS R²为0.46，而两个树模型均为负值。这一模式与3Y恰好相反，其成因在于5Y利差样本后期（测试窗）波动率极低、长期贴水运行，自回归结构近似单位根，树模型基于历史区间的非线性结构在测试期发生了机制漂移；而OLS对长债利差的线性趋势拟合恰好适应了这一低波动区间。这一发现构成期限异质性的重要证据：利差驱动机制的有效性随期限变化，3Y利差承载了更多流动性敏感信息（短端资金面与交易盘行为），非线性结构显著；5Y利差则更多由利率曲线整体位移主导，机制更接近线性且不稳定。这一结论同时提示，在实务中针对不同期限的利差应分别建模，不宜统一套用单一模型族。</w:t>
+        <w:t>5年期利差的结果恰好相反：中票5Y的OLS R²为0.46，两个树模型均为负。原因可能是5Y利差在测试窗内波动极低、长期贴水运行，序列近似单位根，树模型在训练期学到的非线性结构到测试期发生了漂移，而OLS对线性趋势的拟合恰好适应了这一区间。这意味着利差驱动机制的有效性随期限而变：3Y利差承载了更多流动性敏感信息（短端资金面与交易盘行为），非线性结构显著；5Y利差更多跟随利率曲线的整体位移，机制更接近线性且不稳定。实务中对不同期限的利差宜分别建模。</w:t>
       </w:r>
     </w:p>
     <w:p>
@@ -2419,7 +2374,7 @@
           <w:i w:val="0"/>
           <w:sz w:val="21"/>
         </w:rPr>
-        <w:t>图3报告了中票3Y利差XGBoost模型的SHAP特征重要性（平均绝对SHAP值）排序。重要性呈现鲜明的两极分化：利差自身滞后1周（lag_1）以0.269的贡献独占鳌头，是第二名SHIBOR 3M（0.089）的三倍；10年期国债收益率水平（0.011）位居第三，而滞后2—4周、PPI、期限利差、社融等其余特征的贡献均在0.01以下。商行债3Y的分解结构高度一致：lag_1（0.263）与SHIBOR 3M（0.026）同样居于前两位。</w:t>
+        <w:t>图3是中票3Y利差XGBoost模型的SHAP重要性排序（平均绝对SHAP值）。利差自身滞后1周（lag_1）以0.269居首，约为第二名SHIBOR 3M（0.089）的三倍；10年期国债收益率水平（0.011）列第三，滞后2—4周、PPI、期限利差、社融等其余特征均低于0.01。商行债3Y的结构类似，前两位同样是lag_1（0.263）与SHIBOR 3M（0.026）。</w:t>
       </w:r>
     </w:p>
     <w:p>
@@ -2542,7 +2497,7 @@
           <w:i w:val="0"/>
           <w:sz w:val="21"/>
         </w:rPr>
-        <w:t>这一结果具有明确的经济学含义。首先，自回归动量的主导地位表明信用利差具有较强的短期惯性，周度频率上利差的延续性远强于对外生冲击的即时反应，这与利差序列的平滑性与机构行为的路径依赖一致。其次，SHIBOR 3M作为流动性变量稳居次席，印证了纪志宏和曹媛媛（2017）与Huang、Liu和Shi（2023）关于流动性溢价主导中国信用债定价的判断：在本文的周度设定下，货币市场资金面状况是除利差自身惯性外最重要的驱动因素。最后，CPI、PPI、PMI、M2等宏观基本面变量的边际贡献普遍微弱，这一发现与Collin-Dufresne等（2001）的经典结论形成呼应——宏观基本面难以直接解释利差的高频变动，利差波动更多由市场层面的共同因子驱动。H2得到支持。</w:t>
+        <w:t>这一排序的经济含义比较清楚。lag_1主导说明利差在周度频率上惯性很强，延续性远强于对外生冲击的即时反应，这与利差序列的平滑性和机构行为的路径依赖一致。SHIBOR 3M列第二，与纪志宏和曹媛媛（2017）以及Huang、Liu和Shi（2023）关于流动性溢价主导中国信用债定价的结论相符：在周度设定下，资金面是利差自身惯性之外最重要的驱动因素。CPI、PPI、PMI、M2的贡献都很弱，呼应Collin-Dufresne等（2001）的经典发现——宏观基本面难以解释利差的高频变动，利差波动更多由市场层面的共同因子驱动。H2得到支持。</w:t>
       </w:r>
     </w:p>
     <w:p>
@@ -2557,7 +2512,7 @@
           <w:i w:val="0"/>
           <w:sz w:val="21"/>
         </w:rPr>
-        <w:t>从图4的品种间对比可以进一步观察到：四个目标的SHAP结构共享同一模式（滞后项+流动性主导），但流动性变量的重要性在商行债上明显弱于中票。这一差异可能源于两类品种投资者结构的差别：中票的定价权更多掌握在交易型机构手中，对资金面变化高度敏感；商行债的持有者以银行自营与配置盘为主，交易频率低，利差对流动性的即时反应相对钝化。这一品种异质性为"谁在交易信用债"提供了间接证据，也提示监管层在监测流动性风险时应重点关注交易属性更强的品种。</w:t>
+        <w:t>图4的品种间对比还显示，流动性变量在商行债上的重要性明显弱于中票。一个可能的解释是投资者结构不同：中票的定价权更多在交易型机构手中，对资金面变化高度敏感；商行债的持有者以银行自营与配置盘为主，交易频率低，利差对流动性的即时反应相对钝化。这一差异间接反映了"谁在交易信用债"，也提示监管在监测流动性风险时应更关注交易属性强的品种。</w:t>
       </w:r>
     </w:p>
     <w:p>
@@ -2586,7 +2541,7 @@
           <w:i w:val="0"/>
           <w:sz w:val="21"/>
         </w:rPr>
-        <w:t>表3报告了expanding-window滚动预测的评估结果。四条利差的XGBoost预测RMSE均低于随机游走基准，改善幅度介于9.1%至25.4%：中票3Y的RMSE由随机游走的0.0827降至0.0617，改善25.4%，最为显著；中票5Y改善17.8%；商行债3Y改善17.0%；商行债5Y改善9.1%。MAE呈现同样的改进模式。方向准确率方面，中票5Y达到54.9%，超过随机猜测水平约5个百分点；其余三条利差的方向准确率在46%—49%之间。H3得到支持：模型在严格无泄漏的样本外设定下具备超越随机游走的真实预测增量，且该增量在不同品种与期限上稳健存在。</w:t>
+        <w:t>表3报告了expanding-window滚动预测的评估结果。四条利差的XGBoost预测RMSE均低于随机游走，改善幅度在9.1%—25.4%之间：中票3Y从0.0827降至0.0617，改善25.4%；中票5Y改善17.8%；商行债3Y改善17.0%；商行债5Y改善9.1%。MAE的改进方向一致。方向准确率方面，中票5Y为54.9%，其余三条利差在46%—49%之间。H3得到支持：在无泄漏的样本外设定下，模型对随机游走有稳定的预测增量，且这一增量在不同品种与期限上稳健存在。</w:t>
       </w:r>
     </w:p>
     <w:tbl>
@@ -3355,7 +3310,7 @@
           <w:i w:val="0"/>
           <w:sz w:val="21"/>
         </w:rPr>
-        <w:t>图5展示了中票3Y利差的滚动预测轨迹。可以看到，预测值紧贴实际值的均值回归路径，在2024年以来的利差单边压缩阶段仍保持了良好的跟踪能力，未出现系统性偏离。值得注意的是，模型的优势集中在水平预测而非方向预测：滚动窗口下预测误差的降低主要来源于对利差均值回归速度与路径的刻画，而方向准确率仅小幅超越随机基准，说明利差的周度方向变化中仍有大量接近白噪声的成分，这与SHAP分解中自回归项主导的发现互为印证——利差的可预测部分主要是其持续性部分。</w:t>
+        <w:t>图5是中票3Y的滚动预测轨迹，预测值基本贴合实际值的均值回归路径，在2024年以来的利差单边压缩阶段未出现系统性偏离。模型的优势集中在水平预测而非方向预测：预测误差的下降主要来自对利差均值回归速度与路径的刻画，方向准确率仅小幅超过随机基准，说明利差周度方向变化中仍有大量接近白噪声的成分。这与SHAP分解中lag_1主导的结果互为印证——利差的可预测部分主要是其持续性部分。</w:t>
       </w:r>
     </w:p>
     <w:p>
@@ -3384,7 +3339,7 @@
           <w:i w:val="0"/>
           <w:sz w:val="21"/>
         </w:rPr>
-        <w:t>综合上述三组证据，本文的结果链条完整且自洽：模型对比证实非线性机制的存在（H1），SHAP分解揭示自回归与流动性双重主导的结构（H2），滚动预测证实样本外增量（H3）。就稳健性而言，四组利差在品种与期限维度上形成了天然的交叉验证：流动性主导的结构在中票上最强、商行债上次之；非线性优势在3Y上稳健，在5Y上则让位于线性趋势——两种模式均有清晰的经济机理支撑，而非孤立的统计巧合。就机制而言，本文的结果指向一个统一解释：中国信用利差的周度动态由"惯性+资金面"驱动，宏观基本面信息主要通过影响资金面预期间接传导，且传导在交易属性强的品种与短端期限上更为直接。</w:t>
+        <w:t>三组证据放在一起看，链条是完整的：模型对比显示非线性机制存在（H1），SHAP分解指向自回归与流动性双重主导（H2），滚动预测证实样本外增量（H3）。四组利差本身构成了一种交叉验证——流动性主导的结构在中票上最强、商行债上次之；非线性优势在3Y上稳健，5Y上则让位于线性趋势，两种模式都有相应的经济机理支撑，而非孤立的统计巧合。综合起来，中国信用利差的周度动态可以概括为"惯性加资金面"：宏观基本面信息主要通过资金面预期间接传导，且这一传导在交易属性强的品种和短端期限上更直接。</w:t>
       </w:r>
     </w:p>
     <w:p>
@@ -3399,7 +3354,7 @@
           <w:i w:val="0"/>
           <w:sz w:val="24"/>
         </w:rPr>
-        <w:t>六、结论与政策建议</w:t>
+        <w:t>六、结论</w:t>
       </w:r>
     </w:p>
     <w:p>
@@ -3414,7 +3369,7 @@
           <w:i w:val="0"/>
           <w:sz w:val="21"/>
         </w:rPr>
-        <w:t>本文以2016—2026年中国信用债周度数据为样本，构建品种×期限四组信用利差，比较OLS、随机森林与XGBoost三类模型的样本内解释力，运用SHAP方法分解特征贡献，并通过expanding-window滚动框架进行严格样本外检验。主要结论如下：</w:t>
+        <w:t>本文以2016—2026年中国信用债周度数据为样本，构建品种×期限四组利差，比较OLS、随机森林与XGBoost的样本内解释力，用SHAP方法分解特征贡献，并通过滚动样本外检验考察预测表现。结果可以归纳为三点。</w:t>
       </w:r>
     </w:p>
     <w:p>
@@ -3429,7 +3384,7 @@
           <w:i w:val="0"/>
           <w:sz w:val="21"/>
         </w:rPr>
-        <w:t>第一，中国信用利差的驱动机制存在显著非线性。3年期利差上线性模型测试集R²为负而树模型达到0.36—0.69，表明简单线性投影无法刻画利差与驱动因素之间的真实关系，传统线性研究框架可能系统性低估了可解释部分。</w:t>
+        <w:t>第一，信用利差的驱动机制存在明显的非线性。3年期利差上线性模型测试集R²为负，树模型达到0.36—0.69，线性框架可能系统性低估了利差的可解释部分。</w:t>
       </w:r>
     </w:p>
     <w:p>
@@ -3444,7 +3399,7 @@
           <w:i w:val="0"/>
           <w:sz w:val="21"/>
         </w:rPr>
-        <w:t>第二，利差周度变动由自回归动量与流动性因素双重主导。SHAP分解显示利差自身滞后项贡献了约四分之三的模型解释力，SHIBOR 3M稳居第二，而CPI、PPI、PMI等宏观基本面变量贡献微弱，与Collin-Dufresne等（2001）的经典发现一致，亦呼应了中国市场流动性溢价主导定价的既有证据（纪志宏和曹媛媛，2017；Huang、Liu和Shi，2023）。</w:t>
+        <w:t>第二，利差周度变动由自回归动量与流动性因素主导。SHAP分解中利差滞后项贡献了模型解释力的大部分，SHIBOR 3M居第二，CPI、PPI、PMI等宏观基本面变量贡献微弱，这与Collin-Dufresne等（2001）的经典发现一致，也呼应纪志宏和曹媛媛（2017）关于流动性溢价主导中国信用债定价的证据。</w:t>
       </w:r>
     </w:p>
     <w:p>
@@ -3459,7 +3414,7 @@
           <w:i w:val="0"/>
           <w:sz w:val="21"/>
         </w:rPr>
-        <w:t>第三，机器学习模型具备超越随机游走的样本外预测能力。四条利差的滚动预测RMSE改善9%—25%，且该优势在品种与期限维度上稳健。</w:t>
+        <w:t>第三，机器学习模型具备超越随机游走的样本外预测能力，四条利差的滚动预测RMSE改善9%—25%，且这一优势在不同品种与期限上稳定存在。</w:t>
       </w:r>
     </w:p>
     <w:p>
@@ -3474,22 +3429,7 @@
           <w:i w:val="0"/>
           <w:sz w:val="21"/>
         </w:rPr>
-        <w:t>本文的政策与实务含义有三：其一，对投资者而言，信用利差的周度监测应重点关注资金面指标与利差自身动量，宏观数据的边际信息有限，据此构建的组合再平衡规则有望获得可观的效率改进；其二，对监管者而言，流动性因素对利差的支配性影响提示，货币市场波动向信用债市场的传导是金融稳定的重要渠道，监测交易属性强的品种（如中票）的资金面敏感度可作为系统性风险的早期预警指标；其三，对方法论而言，非线性机器学习与SHAP可解释性的结合为固定收益研究提供了兼顾预测与解释的分析范式，本文的全部代码与数据获取流程已开源，可供后续研究直接复现与扩展。</w:t>
-      </w:r>
-    </w:p>
-    <w:p>
-      <w:pPr>
-        <w:spacing w:before="0" w:after="40" w:line="360" w:lineRule="auto"/>
-        <w:ind w:firstLine="420"/>
-      </w:pPr>
-      <w:r>
-        <w:rPr>
-          <w:rFonts w:ascii="Times New Roman" w:hAnsi="Times New Roman" w:eastAsia="宋体"/>
-          <w:b w:val="0"/>
-          <w:i w:val="0"/>
-          <w:sz w:val="21"/>
-        </w:rPr>
-        <w:t>本文的不足与展望包括：样本仅覆盖AAA评级，评级维度的异质性有待扩展；特征集以宏观与市场变量为主，债券发行层面的微观信息（评级迁移、一级发行利差等）可以进一步纳入；滚动预测的步进设定（4周）较长，更高频的再平衡策略值得检验。后续研究可在上述方向深化。</w:t>
+        <w:t>对实务而言，利差监测可以更聚焦于资金面指标与利差自身动量，宏观数据的边际信息有限；对监管而言，流动性向信用债市场的传导值得持续关注，交易属性强的品种（如中票）的资金面敏感度可作为风险预警的参考指标。本文样本限于AAA评级，尚未纳入债券发行层面的微观信息（如评级迁移、一级发行利差），滚动步长也较长，后续可以在评级异质性、微观特征与更高频的再平衡策略方面继续深入。</w:t>
       </w:r>
     </w:p>
     <w:p>

</xml_diff>